<commit_message>
docs: align release artifacts with latest reviewed book
</commit_message>
<xml_diff>
--- a/templates/book-style-template.docx
+++ b/templates/book-style-template.docx
@@ -542,7 +542,7 @@
         <w:color w:val="4A6078"/>
         <w:sz w:val="14"/>
       </w:rPr>
-      <w:t>BUILDING ENTERPRISE GENERAL INTELLIGENCE PLATFORM</w:t>
+      <w:t>BUILDING AN ENTERPRISE GENERAL INTELLIGENCE PLATFORM</w:t>
     </w:r>
   </w:p>
 </w:hdr>
@@ -922,12 +922,13 @@
     <w:qFormat/>
     <w:rsid w:val="00FC693F"/>
     <w:pPr>
-      <w:spacing w:after="100" w:line="254" w:lineRule="auto"/>
+      <w:spacing w:after="120" w:line="280" w:lineRule="auto"/>
     </w:pPr>
     <w:rPr>
       <w:rFonts w:ascii="Arial" w:hAnsi="Arial"/>
       <w:color w:val="12233F"/>
-      <w:sz w:val="19"/>
+      <w:sz w:val="20"/>
+      <w:szCs w:val="20"/>
     </w:rPr>
   </w:style>
   <w:style w:type="paragraph" w:styleId="Header">

</xml_diff>